<commit_message>
made final changes to Lab1 doc, before submitting
</commit_message>
<xml_diff>
--- a/SC2107/SC2107-Lab1-Handoutv4.1M.docx
+++ b/SC2107/SC2107-Lab1-Handoutv4.1M.docx
@@ -589,8 +589,20 @@
           <w:szCs w:val="20"/>
           <w:lang w:val="en-US"/>
         </w:rPr>
-        <w:t>x = x&gt;&gt;3;</w:t>
-      </w:r>
+        <w:t>x = x&gt;&gt;</w:t>
+      </w:r>
+      <w:proofErr w:type="gramStart"/>
+      <w:r>
+        <w:rPr>
+          <w:rFonts w:ascii="Arial" w:hAnsi="Arial" w:cs="Arial"/>
+          <w:color w:val="FF0000"/>
+          <w:sz w:val="20"/>
+          <w:szCs w:val="20"/>
+          <w:lang w:val="en-US"/>
+        </w:rPr>
+        <w:t>3;</w:t>
+      </w:r>
+      <w:proofErr w:type="gramEnd"/>
     </w:p>
     <w:p>
       <w:pPr>
@@ -617,8 +629,20 @@
           <w:szCs w:val="20"/>
           <w:lang w:val="en-US"/>
         </w:rPr>
-        <w:t>x &amp;= 0x03;</w:t>
-      </w:r>
+        <w:t xml:space="preserve">x &amp;= </w:t>
+      </w:r>
+      <w:proofErr w:type="gramStart"/>
+      <w:r>
+        <w:rPr>
+          <w:rFonts w:ascii="Arial" w:hAnsi="Arial" w:cs="Arial"/>
+          <w:color w:val="FF0000"/>
+          <w:sz w:val="20"/>
+          <w:szCs w:val="20"/>
+          <w:lang w:val="en-US"/>
+        </w:rPr>
+        <w:t>0x03;</w:t>
+      </w:r>
+      <w:proofErr w:type="gramEnd"/>
     </w:p>
     <w:p>
       <w:pPr>
@@ -791,27 +815,7 @@
           <w:szCs w:val="20"/>
           <w:lang w:val="en-US"/>
         </w:rPr>
-        <w:t xml:space="preserve">We need to declare the P1IN register with the volatile keyword because its value can change independently of the program flow, for example, due to hardware events on the Port 1 GPIO pins. Declaring it volatile tells the compiler not to optimize or cache its value, ensuring that every read </w:t>
-      </w:r>
-      <w:r>
-        <w:rPr>
-          <w:rFonts w:ascii="Arial" w:hAnsi="Arial" w:cs="Arial"/>
-          <w:color w:val="FF0000"/>
-          <w:sz w:val="20"/>
-          <w:szCs w:val="20"/>
-          <w:lang w:val="en-US"/>
-        </w:rPr>
-        <w:t>accesses</w:t>
-      </w:r>
-      <w:r>
-        <w:rPr>
-          <w:rFonts w:ascii="Arial" w:hAnsi="Arial" w:cs="Arial"/>
-          <w:color w:val="FF0000"/>
-          <w:sz w:val="20"/>
-          <w:szCs w:val="20"/>
-          <w:lang w:val="en-US"/>
-        </w:rPr>
-        <w:t xml:space="preserve"> the current hardware state. Without volatile, the compiler might assume the value doesn't change and reuse a previous value, leading to incorrect behavior.</w:t>
+        <w:t>We need to declare the P1IN register with the volatile keyword because its value can change independently of the program flow, for example, due to hardware events on the Port 1 GPIO pins. Declaring it volatile tells the compiler not to optimize or cache its value, ensuring that every read accesses the current hardware state. Without volatile, the compiler might assume the value doesn't change and reuse a previous value, leading to incorrect behavior.</w:t>
       </w:r>
     </w:p>
     <w:p>
@@ -1269,7 +1273,62 @@
           <w:szCs w:val="20"/>
           <w:lang w:val="en-US"/>
         </w:rPr>
-        <w:t>The instruction ldr r1, [pc, #0x2e4] loads into R1 the address of the Port 1 SEL0 register (P1-&gt;SEL0). This allows the program to access the register in memory so that it can write 0x00 to it, configuring all Port 1 pins as GPIO</w:t>
+        <w:t>The instruction ldr r1, [</w:t>
+      </w:r>
+      <w:proofErr w:type="gramStart"/>
+      <w:r>
+        <w:rPr>
+          <w:rFonts w:ascii="Arial" w:hAnsi="Arial" w:cs="Arial"/>
+          <w:color w:val="FF0000"/>
+          <w:sz w:val="20"/>
+          <w:szCs w:val="20"/>
+          <w:lang w:val="en-US"/>
+        </w:rPr>
+        <w:t>pc, #</w:t>
+      </w:r>
+      <w:proofErr w:type="gramEnd"/>
+      <w:r>
+        <w:rPr>
+          <w:rFonts w:ascii="Arial" w:hAnsi="Arial" w:cs="Arial"/>
+          <w:color w:val="FF0000"/>
+          <w:sz w:val="20"/>
+          <w:szCs w:val="20"/>
+          <w:lang w:val="en-US"/>
+        </w:rPr>
+        <w:t>0x2e4] loads into R1</w:t>
+      </w:r>
+      <w:r>
+        <w:t xml:space="preserve"> </w:t>
+      </w:r>
+      <w:r>
+        <w:rPr>
+          <w:rFonts w:ascii="Arial" w:hAnsi="Arial" w:cs="Arial"/>
+          <w:color w:val="FF0000"/>
+          <w:sz w:val="20"/>
+          <w:szCs w:val="20"/>
+          <w:lang w:val="en-US"/>
+        </w:rPr>
+        <w:t>the 32-bit value stored at the literal pool location</w:t>
+      </w:r>
+      <w:r>
+        <w:rPr>
+          <w:rFonts w:ascii="Arial" w:hAnsi="Arial" w:cs="Arial"/>
+          <w:color w:val="FF0000"/>
+          <w:sz w:val="20"/>
+          <w:szCs w:val="20"/>
+          <w:lang w:val="en-US"/>
+        </w:rPr>
+        <w:t xml:space="preserve"> which will in turn become</w:t>
+      </w:r>
+      <w:r>
+        <w:rPr>
+          <w:rFonts w:ascii="Arial" w:hAnsi="Arial" w:cs="Arial"/>
+          <w:color w:val="FF0000"/>
+          <w:sz w:val="20"/>
+          <w:szCs w:val="20"/>
+          <w:lang w:val="en-US"/>
+        </w:rPr>
+        <w:t xml:space="preserve"> the address of the Port 1 SEL0 register (P1-&gt;SEL0). This allows the program to access the register in memory so that it can write 0x00 to it, configuring all Port 1 pins as GPIO</w:t>
       </w:r>
     </w:p>
     <w:p>
@@ -1290,6 +1349,7 @@
       <w:r>
         <w:rPr>
           <w:rFonts w:ascii="Arial" w:hAnsi="Arial" w:cs="Arial"/>
+          <w:noProof/>
           <w:color w:val="FF0000"/>
           <w:sz w:val="20"/>
           <w:szCs w:val="20"/>
@@ -1520,17 +1580,7 @@
           <w:szCs w:val="20"/>
           <w:lang w:val="en-US"/>
         </w:rPr>
-        <w:t>approximately 255.75 KB is unused and available</w:t>
-      </w:r>
-      <w:r>
-        <w:rPr>
-          <w:rFonts w:ascii="Arial" w:hAnsi="Arial" w:cs="Arial"/>
-          <w:color w:val="FF0000"/>
-          <w:sz w:val="20"/>
-          <w:szCs w:val="20"/>
-          <w:lang w:val="en-US"/>
-        </w:rPr>
-        <w:t xml:space="preserve"> </w:t>
+        <w:t xml:space="preserve">approximately 255.75 KB is unused and available </w:t>
       </w:r>
       <w:r>
         <w:rPr>
@@ -1633,6 +1683,7 @@
       <w:r>
         <w:rPr>
           <w:rFonts w:ascii="Arial" w:hAnsi="Arial" w:cs="Arial"/>
+          <w:noProof/>
           <w:color w:val="FF0000"/>
           <w:sz w:val="20"/>
           <w:szCs w:val="20"/>
@@ -1884,6 +1935,7 @@
       <w:r>
         <w:rPr>
           <w:rFonts w:ascii="Arial" w:hAnsi="Arial" w:cs="Arial"/>
+          <w:noProof/>
           <w:color w:val="FF0000"/>
           <w:sz w:val="20"/>
           <w:szCs w:val="20"/>
@@ -1999,7 +2051,25 @@
           <w:sz w:val="20"/>
           <w:szCs w:val="20"/>
         </w:rPr>
-        <w:t>_Init()?</w:t>
+        <w:t>_</w:t>
+      </w:r>
+      <w:proofErr w:type="gramStart"/>
+      <w:r>
+        <w:rPr>
+          <w:rFonts w:ascii="Arial" w:hAnsi="Arial" w:cs="Arial"/>
+          <w:sz w:val="20"/>
+          <w:szCs w:val="20"/>
+        </w:rPr>
+        <w:t>Init(</w:t>
+      </w:r>
+      <w:proofErr w:type="gramEnd"/>
+      <w:r>
+        <w:rPr>
+          <w:rFonts w:ascii="Arial" w:hAnsi="Arial" w:cs="Arial"/>
+          <w:sz w:val="20"/>
+          <w:szCs w:val="20"/>
+        </w:rPr>
+        <w:t>)?</w:t>
       </w:r>
       <w:r>
         <w:rPr>
@@ -2035,7 +2105,29 @@
           <w:szCs w:val="20"/>
           <w:lang w:val="en-US"/>
         </w:rPr>
-        <w:t>The starting address of Port2_Init() from the map file is 0x0000010F</w:t>
+        <w:t>The starting address of Port2_</w:t>
+      </w:r>
+      <w:proofErr w:type="gramStart"/>
+      <w:r>
+        <w:rPr>
+          <w:rFonts w:ascii="Arial" w:hAnsi="Arial" w:cs="Arial"/>
+          <w:color w:val="FF0000"/>
+          <w:sz w:val="20"/>
+          <w:szCs w:val="20"/>
+          <w:lang w:val="en-US"/>
+        </w:rPr>
+        <w:t>Init(</w:t>
+      </w:r>
+      <w:proofErr w:type="gramEnd"/>
+      <w:r>
+        <w:rPr>
+          <w:rFonts w:ascii="Arial" w:hAnsi="Arial" w:cs="Arial"/>
+          <w:color w:val="FF0000"/>
+          <w:sz w:val="20"/>
+          <w:szCs w:val="20"/>
+          <w:lang w:val="en-US"/>
+        </w:rPr>
+        <w:t>) from the map file is 0x0000010F</w:t>
       </w:r>
       <w:r>
         <w:rPr>
@@ -2065,7 +2157,29 @@
           <w:szCs w:val="20"/>
           <w:lang w:val="en-US"/>
         </w:rPr>
-        <w:t>he Disassembly Window shows 0x0000043A as the starting address of Port2_Init(), which is the actual instruction address in memory. It differs from the map file symbol address (0x0000010F) due to linker relocation and memory alignment</w:t>
+        <w:t>he Disassembly Window shows 0x0000043A as the starting address of Port2_</w:t>
+      </w:r>
+      <w:proofErr w:type="gramStart"/>
+      <w:r>
+        <w:rPr>
+          <w:rFonts w:ascii="Arial" w:hAnsi="Arial" w:cs="Arial"/>
+          <w:color w:val="FF0000"/>
+          <w:sz w:val="20"/>
+          <w:szCs w:val="20"/>
+          <w:lang w:val="en-US"/>
+        </w:rPr>
+        <w:t>Init(</w:t>
+      </w:r>
+      <w:proofErr w:type="gramEnd"/>
+      <w:r>
+        <w:rPr>
+          <w:rFonts w:ascii="Arial" w:hAnsi="Arial" w:cs="Arial"/>
+          <w:color w:val="FF0000"/>
+          <w:sz w:val="20"/>
+          <w:szCs w:val="20"/>
+          <w:lang w:val="en-US"/>
+        </w:rPr>
+        <w:t>), which is the actual instruction address in memory. It differs from the map file symbol address (0x0000010F) due to linker relocation and memory alignment</w:t>
       </w:r>
       <w:r>
         <w:rPr>
@@ -2098,49 +2212,92 @@
           <w:szCs w:val="20"/>
           <w:lang w:val="en-US"/>
         </w:rPr>
-        <w:t>he map file shows the symbol address, while the disassembly window shows the actual aligned instruction address in memory</w:t>
-      </w:r>
-      <w:r>
-        <w:rPr>
-          <w:rFonts w:ascii="Arial" w:hAnsi="Arial" w:cs="Arial"/>
-          <w:color w:val="FF0000"/>
-          <w:sz w:val="20"/>
-          <w:szCs w:val="20"/>
-          <w:lang w:val="en-US"/>
-        </w:rPr>
-        <w:t>, t</w:t>
-      </w:r>
-      <w:r>
-        <w:rPr>
-          <w:rFonts w:ascii="Arial" w:hAnsi="Arial" w:cs="Arial"/>
-          <w:color w:val="FF0000"/>
-          <w:sz w:val="20"/>
-          <w:szCs w:val="20"/>
-          <w:lang w:val="en-US"/>
-        </w:rPr>
-        <w:t>his is because ARM instructions must be halfword (2-byte) aligned, and the linker may pad the section so that the instructions start at the nearest aligned address</w:t>
-      </w:r>
-    </w:p>
-    <w:p>
-      <w:pPr>
-        <w:pStyle w:val="ListParagraph"/>
-        <w:tabs>
-          <w:tab w:val="left" w:pos="709"/>
-          <w:tab w:val="left" w:pos="3979"/>
-          <w:tab w:val="left" w:pos="8789"/>
-        </w:tabs>
-        <w:spacing w:line="480" w:lineRule="auto"/>
-        <w:rPr>
-          <w:rFonts w:ascii="Arial" w:hAnsi="Arial" w:cs="Arial"/>
-          <w:color w:val="FF0000"/>
-          <w:sz w:val="20"/>
-          <w:szCs w:val="20"/>
-          <w:lang w:val="en-US"/>
-        </w:rPr>
-      </w:pPr>
-      <w:r>
-        <w:rPr>
-          <w:rFonts w:ascii="Arial" w:hAnsi="Arial" w:cs="Arial"/>
+        <w:t>he map file shows the symbol address</w:t>
+      </w:r>
+      <w:r>
+        <w:rPr>
+          <w:rFonts w:ascii="Arial" w:hAnsi="Arial" w:cs="Arial"/>
+          <w:color w:val="FF0000"/>
+          <w:sz w:val="20"/>
+          <w:szCs w:val="20"/>
+          <w:lang w:val="en-US"/>
+        </w:rPr>
+        <w:t xml:space="preserve"> or linked address</w:t>
+      </w:r>
+      <w:r>
+        <w:rPr>
+          <w:rFonts w:ascii="Arial" w:hAnsi="Arial" w:cs="Arial"/>
+          <w:color w:val="FF0000"/>
+          <w:sz w:val="20"/>
+          <w:szCs w:val="20"/>
+          <w:lang w:val="en-US"/>
+        </w:rPr>
+        <w:t xml:space="preserve">, while the disassembly window shows the actual </w:t>
+      </w:r>
+      <w:r>
+        <w:rPr>
+          <w:rFonts w:ascii="Arial" w:hAnsi="Arial" w:cs="Arial"/>
+          <w:color w:val="FF0000"/>
+          <w:sz w:val="20"/>
+          <w:szCs w:val="20"/>
+          <w:lang w:val="en-US"/>
+        </w:rPr>
+        <w:t xml:space="preserve">runtime </w:t>
+      </w:r>
+      <w:r>
+        <w:rPr>
+          <w:rFonts w:ascii="Arial" w:hAnsi="Arial" w:cs="Arial"/>
+          <w:color w:val="FF0000"/>
+          <w:sz w:val="20"/>
+          <w:szCs w:val="20"/>
+          <w:lang w:val="en-US"/>
+        </w:rPr>
+        <w:t>aligned instruction address in memory</w:t>
+      </w:r>
+      <w:r>
+        <w:rPr>
+          <w:rFonts w:ascii="Arial" w:hAnsi="Arial" w:cs="Arial"/>
+          <w:color w:val="FF0000"/>
+          <w:sz w:val="20"/>
+          <w:szCs w:val="20"/>
+          <w:lang w:val="en-US"/>
+        </w:rPr>
+        <w:t xml:space="preserve">, </w:t>
+      </w:r>
+      <w:r>
+        <w:rPr>
+          <w:rFonts w:ascii="Arial" w:hAnsi="Arial" w:cs="Arial"/>
+          <w:color w:val="FF0000"/>
+          <w:sz w:val="20"/>
+          <w:szCs w:val="20"/>
+          <w:lang w:val="en-US"/>
+        </w:rPr>
+        <w:t>t</w:t>
+      </w:r>
+      <w:r>
+        <w:rPr>
+          <w:rFonts w:ascii="Arial" w:hAnsi="Arial" w:cs="Arial"/>
+          <w:color w:val="FF0000"/>
+          <w:sz w:val="20"/>
+          <w:szCs w:val="20"/>
+          <w:lang w:val="en-US"/>
+        </w:rPr>
+        <w:t>he difference comes from linker section placement and memory offsets applied during relocation</w:t>
+      </w:r>
+      <w:r>
+        <w:rPr>
+          <w:rFonts w:ascii="Arial" w:hAnsi="Arial" w:cs="Arial"/>
+          <w:color w:val="FF0000"/>
+          <w:sz w:val="20"/>
+          <w:szCs w:val="20"/>
+          <w:lang w:val="en-US"/>
+        </w:rPr>
+        <w:t>.</w:t>
+      </w:r>
+      <w:r>
+        <w:rPr>
+          <w:rFonts w:ascii="Arial" w:hAnsi="Arial" w:cs="Arial"/>
+          <w:noProof/>
           <w:color w:val="FF0000"/>
           <w:sz w:val="20"/>
           <w:szCs w:val="20"/>
@@ -2203,6 +2360,7 @@
       <w:r>
         <w:rPr>
           <w:rFonts w:ascii="Arial" w:hAnsi="Arial" w:cs="Arial"/>
+          <w:noProof/>
           <w:color w:val="FF0000"/>
           <w:sz w:val="20"/>
           <w:szCs w:val="20"/>

</xml_diff>